<commit_message>
Fix PFEM naming and add the geometry figure to the follow-up draft
The draft's point 1 only said the operator was "Transolver, not VINO"
without stating what PFEM (the project's own title/pipeline name)
actually refers to. Found and verified the real citation directly in
train_B1.py's own docstring: PFEM = "Pretrain Finite Element Method"
(Yizheng Wang et al., JMPS 2026) -- the paper this whole pipeline is
adapted from. Point 1 now states this explicitly instead of leaving it
unexplained. Also added point 3, describing the attached geometry
figure's three panels in the email body itself (it had only been sent
as a separate file with no explanation in the actual draft).

Co-Authored-By: Claude Sonnet 5 <noreply@anthropic.com>
Claude-Session: https://claude.ai/code/session_01HX6Lr5YENQbEkvto9y2AB8
</commit_message>
<xml_diff>
--- a/advisor_feedback/2026-09-22_reply_to_round14_followup_draft.docx
+++ b/advisor_feedback/2026-09-22_reply_to_round14_followup_draft.docx
@@ -15,13 +15,13 @@
         <w:rPr>
           <w:i/>
         </w:rPr>
-        <w:t>Covers only points 1 and 2 of that email (naming, and what varies per training sample). The geometry figure he asked for was already sent separately. The resolution/tolerance points (123k/424k 'fairly modest,' 10^5-10^6 elements, neglecting 1%/2%) are intentionally NOT addressed here -- Omar's own instruction was to hold those for a separate decision on how much more GPU time to commit.</w:t>
+        <w:t>Covers points 1 and 2 of that email (naming, and what varies per training sample), plus the geometry figure he asked for (now described in the email body itself, not just sent as an unexplained attachment). The resolution/tolerance points (123k/424k 'fairly modest,' 10^5-10^6 elements, neglecting 1%/2%) are intentionally NOT addressed here -- Omar's own instruction was to hold those for a separate decision on how much more GPU time to commit.</w:t>
       </w:r>
     </w:p>
     <w:p/>
     <w:p>
       <w:r>
-        <w:t>Subject: Re: B3 follow-up -- operator naming and training-sample design</w:t>
+        <w:t>Subject: Re: B3 follow-up -- operator naming, training-sample design, and geometry figure</w:t>
       </w:r>
     </w:p>
     <w:p/>
@@ -32,12 +32,12 @@
     </w:p>
     <w:p>
       <w:r>
-        <w:t>Two quick clarifications on your questions.</w:t>
+        <w:t>Thank you for the feedback -- a few clarifications and the geometry figure you asked for.</w:t>
       </w:r>
     </w:p>
     <w:p>
       <w:r>
-        <w:t>1. The operator we train and report on throughout this project is Transolver (Transolver_Irregular_Mesh), not VINO -- VINO is a separate, third-party codebase we kept vendored only for reference and to cross-check two material-model formulas early on; it is not the architecture used for any of our own results. Happy to use whichever name is clearer going forward, just wanted to flag the distinction in case VINO was meant generically.</w:t>
+        <w:t>1. This project's pipeline follows PFEM ("Pretrain Finite Element Method," Yizheng Wang et al., JMPS 2026) combined with the Transolver architecture -- that is the operator we actually train and report results for throughout. VINO was an early prototype tried in the project's very first week and abandoned; it survives in the repository only as a vendored, unmodified third-party reference, used once to cross-check two material-model formulas for correctness. It is not the architecture behind any of our own trained results. Happy to use whichever name is clearer going forward -- just wanted to flag the distinction in case VINO was meant generically.</w:t>
       </w:r>
     </w:p>
     <w:p>
@@ -47,7 +47,12 @@
     </w:p>
     <w:p>
       <w:r>
-        <w:t>We'll hold the resolution/tolerance points from your email for a separate follow-up once we've worked out how much additional GPU time makes sense.</w:t>
+        <w:t>3. Geometry figure (attached, B3_geometry.png). Three panels: (left) the undeformed geometry -- the outer housing (fixed, blue) and the inner core (red) that receives the rocking rotation; (middle) the same geometry after the rocking rotation is applied, at the same amplitude (0.05 rad) used throughout the mesh-convergence study -- this shows the true rigid-body tilt, not a small-angle approximation; (right) a zoomed meridian cross-section showing the groove -- the one explicit, smooth, finite-radius feature where the stress concentration is measured, with its radius of curvature (0.0912, in the same nondimensional units as the rest of the geometry) marked directly on the plot.</w:t>
+      </w:r>
+    </w:p>
+    <w:p>
+      <w:r>
+        <w:t>We'll hold your resolution/tolerance points (the 123k/424k discretization, the 10^5-10^6 element target, and neglecting the 1%/2% tolerances) for a separate follow-up once we've worked out how much additional GPU time makes sense.</w:t>
       </w:r>
     </w:p>
     <w:p>

</xml_diff>